<commit_message>
Add Claude Code 4 certification (LinkedIn Learning, Oct 2026) to site and CV
</commit_message>
<xml_diff>
--- a/cv/CV_of_Md_Saiful_Islam_Saif_20261012.docx
+++ b/cv/CV_of_Md_Saiful_Islam_Saif_20261012.docx
@@ -6647,6 +6647,53 @@
           <w:szCs w:val="17"/>
         </w:rPr>
         <w:t>2010</w:t>
+      </w:r>
+    </w:p>
+    <w:p>
+      <w:pPr>
+        <w:pStyle w:val="Heading1"/>
+        <w:keepNext/>
+        <w:spacing w:before="182"/>
+        <w:ind w:firstLine="405"/>
+        <w:rPr>
+          <w:rFonts w:asciiTheme="minorHAnsi" w:hAnsiTheme="minorHAnsi" w:cstheme="minorHAnsi"/>
+          <w:b w:val="0"/>
+          <w:sz w:val="17"/>
+          <w:szCs w:val="17"/>
+        </w:rPr>
+      </w:pPr>
+      <w:r>
+        <w:rPr>
+          <w:rFonts w:asciiTheme="minorHAnsi" w:hAnsiTheme="minorHAnsi" w:cstheme="minorHAnsi"/>
+          <w:sz w:val="17"/>
+          <w:szCs w:val="17"/>
+        </w:rPr>
+        <w:t>Certifications:</w:t>
+      </w:r>
+    </w:p>
+    <w:p>
+      <w:pPr>
+        <w:pStyle w:val="Heading1"/>
+        <w:numPr>
+          <w:ilvl w:val="0"/>
+          <w:numId w:val="8"/>
+        </w:numPr>
+        <w:spacing w:before="1"/>
+        <w:rPr>
+          <w:rFonts w:asciiTheme="minorHAnsi" w:hAnsiTheme="minorHAnsi" w:cstheme="minorHAnsi"/>
+          <w:b w:val="0"/>
+          <w:sz w:val="17"/>
+          <w:szCs w:val="17"/>
+        </w:rPr>
+      </w:pPr>
+      <w:r>
+        <w:rPr>
+          <w:rFonts w:asciiTheme="minorHAnsi" w:hAnsiTheme="minorHAnsi" w:cstheme="minorHAnsi"/>
+          <w:b w:val="0"/>
+          <w:sz w:val="17"/>
+          <w:szCs w:val="17"/>
+        </w:rPr>
+        <w:t xml:space="preserve">Claude Code 4: Agentic Coding for Professional Developers, LinkedIn Learning, October 2026</w:t>
       </w:r>
     </w:p>
     <w:p>

</xml_diff>

<commit_message>
Drop AI-assisted workflow bullet from IMI role and hero subtitle
Kept in headline, About, Skills and certification; the role bullets now
list only delivered work.
</commit_message>
<xml_diff>
--- a/cv/CV_of_Md_Saiful_Islam_Saif_20261012.docx
+++ b/cv/CV_of_Md_Saiful_Islam_Saif_20261012.docx
@@ -1697,36 +1697,6 @@
           <w:lang w:val="en-SE"/>
         </w:rPr>
         <w:t xml:space="preserve"> Audit Logging – Built an end-to-end audit logging system for an internal authorization-management tool, with a persistent diff-based audit trail, automatic log rotation and backup, and real-time operational visibility in the UI.</w:t>
-      </w:r>
-    </w:p>
-    <w:p>
-      <w:pPr>
-        <w:pStyle w:val="ListParagraph"/>
-        <w:ind w:left="1234"/>
-        <w:rPr>
-          <w:rFonts w:asciiTheme="minorHAnsi" w:hAnsiTheme="minorHAnsi" w:cstheme="minorHAnsi"/>
-          <w:sz w:val="17"/>
-          <w:szCs w:val="17"/>
-          <w:lang w:val="en-SE"/>
-        </w:rPr>
-      </w:pPr>
-      <w:r>
-        <w:rPr>
-          <w:rFonts w:ascii="Segoe UI Emoji" w:hAnsi="Segoe UI Emoji" w:cs="Segoe UI Emoji"/>
-          <w:sz w:val="17"/>
-          <w:szCs w:val="17"/>
-          <w:lang w:val="en-SE"/>
-        </w:rPr>
-        <w:t>🧠</w:t>
-      </w:r>
-      <w:r>
-        <w:rPr>
-          <w:rFonts w:asciiTheme="minorHAnsi" w:hAnsiTheme="minorHAnsi" w:cstheme="minorHAnsi"/>
-          <w:sz w:val="17"/>
-          <w:szCs w:val="17"/>
-          <w:lang w:val="en-SE"/>
-        </w:rPr>
-        <w:t xml:space="preserve"> AI-Assisted Development – Use AI-assisted development (Claude Code) throughout the engineering workflow: problem analysis, solution design, implementation, code review, and unit testing. I own the technical decisions and verification.</w:t>
       </w:r>
     </w:p>
     <w:p>

</xml_diff>

<commit_message>
Add Claude Code 101 by Anthropic certification (LinkedIn Learning, Oct 2026)
</commit_message>
<xml_diff>
--- a/cv/CV_of_Md_Saiful_Islam_Saif_20261012.docx
+++ b/cv/CV_of_Md_Saiful_Islam_Saif_20261012.docx
@@ -6664,6 +6664,31 @@
           <w:szCs w:val="17"/>
         </w:rPr>
         <w:t xml:space="preserve">Claude Code 4: Agentic Coding for Professional Developers, LinkedIn Learning, October 2026</w:t>
+      </w:r>
+    </w:p>
+    <w:p>
+      <w:pPr>
+        <w:pStyle w:val="Heading1"/>
+        <w:numPr>
+          <w:ilvl w:val="0"/>
+          <w:numId w:val="8"/>
+        </w:numPr>
+        <w:spacing w:before="1"/>
+        <w:rPr>
+          <w:rFonts w:asciiTheme="minorHAnsi" w:hAnsiTheme="minorHAnsi" w:cstheme="minorHAnsi"/>
+          <w:b w:val="0"/>
+          <w:sz w:val="17"/>
+          <w:szCs w:val="17"/>
+        </w:rPr>
+      </w:pPr>
+      <w:r>
+        <w:rPr>
+          <w:rFonts w:asciiTheme="minorHAnsi" w:hAnsiTheme="minorHAnsi" w:cstheme="minorHAnsi"/>
+          <w:b w:val="0"/>
+          <w:sz w:val="17"/>
+          <w:szCs w:val="17"/>
+        </w:rPr>
+        <w:t xml:space="preserve">Claude Code 101 by Anthropic, LinkedIn Learning, October 2026</w:t>
       </w:r>
     </w:p>
     <w:p>

</xml_diff>

<commit_message>
Describe Golang as Hyperledger Fabric chaincode; Meta role in past tense; CV typo fixes
</commit_message>
<xml_diff>
--- a/cv/CV_of_Md_Saiful_Islam_Saif_20261012.docx
+++ b/cv/CV_of_Md_Saiful_Islam_Saif_20261012.docx
@@ -897,7 +897,7 @@
         <w:rPr>
           <w:rFonts w:asciiTheme="minorHAnsi" w:hAnsiTheme="minorHAnsi" w:cstheme="minorHAnsi"/>
         </w:rPr>
-        <w:t>Continuous Learning: Exploring ML/AI platforms, edge compute, and sustainable digital system</w:t>
+        <w:t>Continuous Learning: Exploring ML/AI platforms, edge compute, and sustainable digital systems</w:t>
       </w:r>
     </w:p>
     <w:p>
@@ -1043,7 +1043,7 @@
         <w:rPr>
           <w:rFonts w:asciiTheme="minorHAnsi" w:hAnsiTheme="minorHAnsi" w:cstheme="minorHAnsi"/>
         </w:rPr>
-        <w:t>Blockchain: IBM Hyperledger Fabric, CouchDB, Kafka, distributed ledger integration</w:t>
+        <w:t>Blockchain: IBM Hyperledger Fabric, Golang smart contracts (chaincode), CouchDB, Kafka, distributed ledger integration</w:t>
       </w:r>
     </w:p>
     <w:p>
@@ -2412,7 +2412,7 @@
           <w:sz w:val="17"/>
           <w:szCs w:val="17"/>
         </w:rPr>
-        <w:t>Supporting the development of a large-scale internal platform at Meta as a contingent engineer via Sigma Connectivity AB. My role spans backend and mobile feature development, on-call reliability engineering, and technical leadership within a globally distributed Agile team. The project emphasizes performance, scalability, and adherence to strict security protocols under NDA.</w:t>
+        <w:t>Supported the development of a large-scale internal platform at Meta as a contingent engineer via Sigma Connectivity AB. My role spanned backend and mobile feature development, on-call reliability engineering, and technical leadership within a globally distributed Agile team. The project emphasized performance, scalability, and adherence to strict security protocols under NDA.</w:t>
       </w:r>
     </w:p>
     <w:p>
@@ -2480,7 +2480,7 @@
         <w:rPr>
           <w:rFonts w:asciiTheme="minorHAnsi" w:hAnsiTheme="minorHAnsi" w:cstheme="minorHAnsi"/>
         </w:rPr>
-        <w:t xml:space="preserve"> Feature Development &amp; Optimization – Build and enhance scalable backend services and mobile features using Hack </w:t>
+        <w:t xml:space="preserve"> Feature Development &amp; Optimization – Built and enhanced scalable backend services and mobile features using Hack </w:t>
       </w:r>
       <w:r>
         <w:rPr>
@@ -2519,7 +2519,7 @@
         <w:rPr>
           <w:rFonts w:asciiTheme="minorHAnsi" w:hAnsiTheme="minorHAnsi" w:cstheme="minorHAnsi"/>
         </w:rPr>
-        <w:t>️ Production Support &amp; System Reliability – Handle on-call engineering, diagnose issues, and deliver fixes across critical environments.</w:t>
+        <w:t>️ Production Support &amp; System Reliability – Handled on-call engineering, diagnosed issues, and delivered fixes across critical environments.</w:t>
       </w:r>
     </w:p>
     <w:p>
@@ -2546,7 +2546,7 @@
         <w:rPr>
           <w:rFonts w:asciiTheme="minorHAnsi" w:hAnsiTheme="minorHAnsi" w:cstheme="minorHAnsi"/>
         </w:rPr>
-        <w:t xml:space="preserve"> Technical Leadership &amp; Mentorship – Guide sprint planning, mentor junior engineers, and uphold internal development standards.</w:t>
+        <w:t xml:space="preserve"> Technical Leadership &amp; Mentorship – Guided sprint planning, mentored junior engineers, and upheld internal development standards.</w:t>
       </w:r>
     </w:p>
     <w:p>
@@ -2573,7 +2573,7 @@
         <w:rPr>
           <w:rFonts w:asciiTheme="minorHAnsi" w:hAnsiTheme="minorHAnsi" w:cstheme="minorHAnsi"/>
         </w:rPr>
-        <w:t xml:space="preserve"> Stakeholder Collaboration – Coordinate with Meta’s product owners, engineers, and POCs across time zones and teams.</w:t>
+        <w:t xml:space="preserve"> Stakeholder Collaboration – Coordinated with Meta’s product owners, engineers, and POCs across time zones and teams.</w:t>
       </w:r>
     </w:p>
     <w:p>
@@ -2600,7 +2600,7 @@
         <w:rPr>
           <w:rFonts w:asciiTheme="minorHAnsi" w:hAnsiTheme="minorHAnsi" w:cstheme="minorHAnsi"/>
         </w:rPr>
-        <w:t>️ Architecture &amp; Code Quality – Contribute to internal frameworks, conduct code reviews, and enforce engineering best practices.</w:t>
+        <w:t>️ Architecture &amp; Code Quality – Contributed to internal frameworks, conducted code reviews, and enforced engineering best practices.</w:t>
       </w:r>
     </w:p>
     <w:p>
@@ -3307,7 +3307,7 @@
           <w:sz w:val="17"/>
           <w:szCs w:val="17"/>
         </w:rPr>
-        <w:t xml:space="preserve"> and microservices (Java/Spring Boot, Golang) for interfacing between the blockchain and external applications.</w:t>
+        <w:t xml:space="preserve"> and microservices (Java/Spring Boot) for interfacing between the blockchain and external applications, and wrote Hyperledger Fabric smart contracts (chaincode) in Golang.</w:t>
       </w:r>
     </w:p>
     <w:p>
@@ -3517,7 +3517,7 @@
           <w:sz w:val="17"/>
           <w:szCs w:val="17"/>
         </w:rPr>
-        <w:t>Backend &amp; APIs: Java, Spring Boot, Golang, RESTful APIs</w:t>
+        <w:t>Backend &amp; APIs: Java, Spring Boot, RESTful APIs</w:t>
       </w:r>
     </w:p>
     <w:p>
@@ -3536,7 +3536,7 @@
           <w:sz w:val="17"/>
           <w:szCs w:val="17"/>
         </w:rPr>
-        <w:t>Blockchain &amp; Messaging: IBM Hyperledger Fabric, CouchDB, Kafka</w:t>
+        <w:t>Blockchain &amp; Messaging: IBM Hyperledger Fabric, Golang chaincode (smart contracts), CouchDB, Kafka</w:t>
       </w:r>
     </w:p>
     <w:p>
@@ -4176,7 +4176,7 @@
         <w:rPr>
           <w:rFonts w:asciiTheme="minorHAnsi" w:hAnsiTheme="minorHAnsi" w:cstheme="minorHAnsi"/>
         </w:rPr>
-        <w:t>and    amplifying</w:t>
+        <w:t>and simplifying</w:t>
       </w:r>
       <w:r>
         <w:rPr>
@@ -7618,7 +7618,7 @@
           <w:rFonts w:asciiTheme="minorHAnsi" w:hAnsiTheme="minorHAnsi" w:cstheme="minorHAnsi"/>
           <w:bCs/>
         </w:rPr>
-        <w:t>Swedish (</w:t>
+        <w:t>Swedish </w:t>
       </w:r>
       <w:r>
         <w:rPr>

</xml_diff>

<commit_message>
CV: drop serverless and GitHub Actions pipeline claims
</commit_message>
<xml_diff>
--- a/cv/CV_of_Md_Saiful_Islam_Saif_20261012.docx
+++ b/cv/CV_of_Md_Saiful_Islam_Saif_20261012.docx
@@ -825,7 +825,7 @@
         <w:rPr>
           <w:rFonts w:asciiTheme="minorHAnsi" w:hAnsiTheme="minorHAnsi" w:cstheme="minorHAnsi"/>
         </w:rPr>
-        <w:t>Cloud &amp; DevOps Engineering: Experienced in Azure, AWS, serverless architectures, Docker, Kubernetes, and CI/CD pipelines using GitHub Actions and Jenkins within Agile delivery environments.</w:t>
+        <w:t>Cloud &amp; DevOps Engineering: Experienced in Azure, AWS, Docker and Kubernetes, working in teams with CI/CD (Jenkins, Azure DevOps) within Agile delivery environments.</w:t>
       </w:r>
     </w:p>
     <w:p>
@@ -1007,7 +1007,7 @@
         <w:rPr>
           <w:rFonts w:asciiTheme="minorHAnsi" w:hAnsiTheme="minorHAnsi" w:cstheme="minorHAnsi"/>
         </w:rPr>
-        <w:t>DevOps Tools: Jenkins, GitHub Actions, Docker, Kubernetes</w:t>
+        <w:t>DevOps Tools: Jenkins, Azure DevOps, Docker, Kubernetes</w:t>
       </w:r>
     </w:p>
     <w:p>

</xml_diff>